<commit_message>
Eye Reflex Lab: Versionen Freemium und Studien, Code-Freischaltung, wissenschaftliche Begriffe; Version 2.3.0
- Freemium: messen und Ergebnis ansehen, nichts wird gespeichert; Versuchsbedingungen nur für die Sitzung
- Studien („Study cases“): Teilnehmende, Messreihen, Vergleich, Export/Import; Freischaltung per Code
  (Eingabe oder Link ?code=), im Repo nur SHA-256-Prüfsummen (config/editions.json, tools/new_code.py);
  purchaseUrl als Vorbereitung für eine spätere Bezahlung
- Name Eye Reflex Lab mit Untertitel; Begriffe generisch wissenschaftlich (Teilnehmende, erste Messung,
  Durchgang, Versuchsbedingungen, Reizmuster, Messreihe, Instruktion, Kopfbewegung); Kartentexte nach
  Claims-Leitfaden; neutrale Farbe statt Ampelfarben im Ergebnis
- Anleitung de/en/he mit Abschnitt „Zwei Versionen“, Word-Dateien neu erzeugt; README, CLAUDE.md

Co-Authored-By: Claude Opus 5.5 <noreply@anthropic.com>
</commit_message>
<xml_diff>
--- a/docs/guide_de.docx
+++ b/docs/guide_de.docx
@@ -11,16 +11,25 @@
           <w:rFonts w:ascii="Calibri" w:hAnsi="Calibri" w:eastAsia="Calibri" w:cs="Arial"/>
           <w:lang w:val="de-DE"/>
         </w:rPr>
-        <w:t>OKR-Schnellcheck – Anleitung</w:t>
+        <w:t>Eye Reflex Lab – Anleitung</w:t>
       </w:r>
     </w:p>
     <w:p>
       <w:r>
         <w:rPr>
           <w:rFonts w:ascii="Calibri" w:hAnsi="Calibri" w:eastAsia="Calibri" w:cs="Arial"/>
+          <w:b/>
+          <w:bCs/>
           <w:lang w:val="de-DE"/>
         </w:rPr>
-        <w:t xml:space="preserve">Stand: 23. Oktober 2026 · App-Version 2.2 · </w:t>
+        <w:t>Das Experiment zum optokinetischen Reflex</w:t>
+      </w:r>
+      <w:r>
+        <w:rPr>
+          <w:rFonts w:ascii="Calibri" w:hAnsi="Calibri" w:eastAsia="Calibri" w:cs="Arial"/>
+          <w:lang w:val="de-DE"/>
+        </w:rPr>
+        <w:t xml:space="preserve"> · Stand: 24. Oktober 2026 · App-Version 2.3 · </w:t>
       </w:r>
       <w:hyperlink r:id="rId9">
         <w:r>
@@ -58,7 +67,7 @@
                 <w:bCs/>
                 <w:lang w:val="de-DE"/>
               </w:rPr>
-              <w:t>Wellness-Anwendung, kein Medizinprodukt.</w:t>
+              <w:t>Eye Reflex Lab ist eine Wellness- und Lehranwendung, kein Medizinprodukt.</w:t>
             </w:r>
             <w:r>
               <w:rPr>
@@ -119,7 +128,7 @@
           <w:rFonts w:ascii="Calibri" w:hAnsi="Calibri" w:eastAsia="Calibri" w:cs="Arial"/>
           <w:lang w:val="de-DE"/>
         </w:rPr>
-        <w:t xml:space="preserve">Der OKR-Schnellcheck macht sichtbar, wie Ihre Augen einem bewegten Muster folgen: mit der Frontkamera des Geräts, in wenigen Minuten. Verglichen wird </w:t>
+        <w:t xml:space="preserve">Eye Reflex Lab macht sichtbar, wie die Augen einem bewegten Muster folgen: mit der Frontkamera des Geräts, in wenigen Minuten. Es ist ein Experiment zum Mitmachen – für Kurs, Unterricht und Neugierige. Verglichen wird </w:t>
       </w:r>
       <w:r>
         <w:rPr>
@@ -128,7 +137,7 @@
           <w:bCs/>
           <w:lang w:val="de-DE"/>
         </w:rPr>
-        <w:t>nur mit Ihren eigenen früheren Messungen</w:t>
+        <w:t>nur mit eigenen früheren Messungen</w:t>
       </w:r>
       <w:r>
         <w:rPr>
@@ -168,7 +177,7 @@
           <w:rFonts w:ascii="Calibri" w:hAnsi="Calibri" w:eastAsia="Calibri" w:cs="Arial"/>
           <w:lang w:val="de-DE"/>
         </w:rPr>
-        <w:t xml:space="preserve"> iPad oder iPhone mit Safari, oder ein Android-Tablet bzw. -Smartphone mit Chrome. Auf einem Tablet ist die Musterfläche größer, das ist angenehmer.</w:t>
+        <w:t xml:space="preserve"> iPad oder iPhone mit Safari, oder ein Android-Tablet bzw. -Smartphone mit Chrome. Auf einem Tablet ist die Reizfläche größer, das ist angenehmer.</w:t>
       </w:r>
     </w:p>
     <w:p>
@@ -450,7 +459,495 @@
           <w:rFonts w:ascii="Calibri" w:hAnsi="Calibri" w:eastAsia="Calibri" w:cs="Arial"/>
           <w:lang w:val="de-DE"/>
         </w:rPr>
-        <w:t>4 Gerät einrichten (einmalig)</w:t>
+        <w:t>4 Zwei Versionen: Freemium und Studien</w:t>
+      </w:r>
+    </w:p>
+    <w:tbl>
+      <w:tblPr>
+        <w:tblStyle w:val="TableGrid"/>
+        <w:tblW w:type="auto" w:w="0"/>
+        <w:tblLook w:firstColumn="1" w:firstRow="1" w:lastColumn="0" w:lastRow="0" w:noHBand="0" w:noVBand="1" w:val="04A0"/>
+      </w:tblPr>
+      <w:tblGrid>
+        <w:gridCol w:w="3137"/>
+        <w:gridCol w:w="3137"/>
+        <w:gridCol w:w="3137"/>
+      </w:tblGrid>
+      <w:tr>
+        <w:trPr>
+          <w:tblHeader/>
+        </w:trPr>
+        <w:tc>
+          <w:tcPr>
+            <w:tcW w:type="dxa" w:w="3137"/>
+            <w:shd w:val="clear" w:color="auto" w:fill="1E5A7A"/>
+          </w:tcPr>
+          <w:p>
+            <w:pPr>
+              <w:spacing w:after="40"/>
+            </w:pPr>
+          </w:p>
+        </w:tc>
+        <w:tc>
+          <w:tcPr>
+            <w:tcW w:type="dxa" w:w="3137"/>
+            <w:shd w:val="clear" w:color="auto" w:fill="1E5A7A"/>
+          </w:tcPr>
+          <w:p>
+            <w:pPr>
+              <w:spacing w:after="40"/>
+            </w:pPr>
+            <w:r>
+              <w:rPr>
+                <w:rFonts w:ascii="Calibri" w:hAnsi="Calibri" w:eastAsia="Calibri" w:cs="Arial"/>
+                <w:b/>
+                <w:bCs/>
+                <w:color w:val="FFFFFF"/>
+                <w:sz w:val="19"/>
+                <w:lang w:val="de-DE"/>
+                <w:szCs w:val="19"/>
+              </w:rPr>
+              <w:t>Freemium</w:t>
+            </w:r>
+          </w:p>
+        </w:tc>
+        <w:tc>
+          <w:tcPr>
+            <w:tcW w:type="dxa" w:w="3137"/>
+            <w:shd w:val="clear" w:color="auto" w:fill="1E5A7A"/>
+          </w:tcPr>
+          <w:p>
+            <w:pPr>
+              <w:spacing w:after="40"/>
+            </w:pPr>
+            <w:r>
+              <w:rPr>
+                <w:rFonts w:ascii="Calibri" w:hAnsi="Calibri" w:eastAsia="Calibri" w:cs="Arial"/>
+                <w:b/>
+                <w:bCs/>
+                <w:color w:val="FFFFFF"/>
+                <w:sz w:val="19"/>
+                <w:lang w:val="de-DE"/>
+                <w:szCs w:val="19"/>
+              </w:rPr>
+              <w:t>Studien</w:t>
+            </w:r>
+          </w:p>
+        </w:tc>
+      </w:tr>
+      <w:tr>
+        <w:tc>
+          <w:tcPr>
+            <w:tcW w:type="dxa" w:w="3137"/>
+          </w:tcPr>
+          <w:p>
+            <w:pPr>
+              <w:spacing w:after="40"/>
+            </w:pPr>
+            <w:r>
+              <w:rPr>
+                <w:rFonts w:ascii="Calibri" w:hAnsi="Calibri" w:eastAsia="Calibri" w:cs="Arial"/>
+                <w:sz w:val="19"/>
+                <w:lang w:val="de-DE"/>
+                <w:szCs w:val="19"/>
+              </w:rPr>
+              <w:t>Messen und Ergebnis ansehen</w:t>
+            </w:r>
+          </w:p>
+        </w:tc>
+        <w:tc>
+          <w:tcPr>
+            <w:tcW w:type="dxa" w:w="3137"/>
+          </w:tcPr>
+          <w:p>
+            <w:pPr>
+              <w:spacing w:after="40"/>
+            </w:pPr>
+            <w:r>
+              <w:rPr>
+                <w:rFonts w:ascii="Calibri" w:hAnsi="Calibri" w:eastAsia="Calibri" w:cs="Arial"/>
+                <w:sz w:val="19"/>
+                <w:lang w:val="de-DE"/>
+                <w:szCs w:val="19"/>
+              </w:rPr>
+              <w:t>✓</w:t>
+            </w:r>
+          </w:p>
+        </w:tc>
+        <w:tc>
+          <w:tcPr>
+            <w:tcW w:type="dxa" w:w="3137"/>
+          </w:tcPr>
+          <w:p>
+            <w:pPr>
+              <w:spacing w:after="40"/>
+            </w:pPr>
+            <w:r>
+              <w:rPr>
+                <w:rFonts w:ascii="Calibri" w:hAnsi="Calibri" w:eastAsia="Calibri" w:cs="Arial"/>
+                <w:sz w:val="19"/>
+                <w:lang w:val="de-DE"/>
+                <w:szCs w:val="19"/>
+              </w:rPr>
+              <w:t>✓</w:t>
+            </w:r>
+          </w:p>
+        </w:tc>
+      </w:tr>
+      <w:tr>
+        <w:tc>
+          <w:tcPr>
+            <w:tcW w:type="dxa" w:w="3137"/>
+          </w:tcPr>
+          <w:p>
+            <w:pPr>
+              <w:spacing w:after="40"/>
+            </w:pPr>
+            <w:r>
+              <w:rPr>
+                <w:rFonts w:ascii="Calibri" w:hAnsi="Calibri" w:eastAsia="Calibri" w:cs="Arial"/>
+                <w:sz w:val="19"/>
+                <w:lang w:val="de-DE"/>
+                <w:szCs w:val="19"/>
+              </w:rPr>
+              <w:t>Versuchsbedingungen wählen</w:t>
+            </w:r>
+          </w:p>
+        </w:tc>
+        <w:tc>
+          <w:tcPr>
+            <w:tcW w:type="dxa" w:w="3137"/>
+          </w:tcPr>
+          <w:p>
+            <w:pPr>
+              <w:spacing w:after="40"/>
+            </w:pPr>
+            <w:r>
+              <w:rPr>
+                <w:rFonts w:ascii="Calibri" w:hAnsi="Calibri" w:eastAsia="Calibri" w:cs="Arial"/>
+                <w:sz w:val="19"/>
+                <w:lang w:val="de-DE"/>
+                <w:szCs w:val="19"/>
+              </w:rPr>
+              <w:t>✓ (nur für die laufende Sitzung)</w:t>
+            </w:r>
+          </w:p>
+        </w:tc>
+        <w:tc>
+          <w:tcPr>
+            <w:tcW w:type="dxa" w:w="3137"/>
+          </w:tcPr>
+          <w:p>
+            <w:pPr>
+              <w:spacing w:after="40"/>
+            </w:pPr>
+            <w:r>
+              <w:rPr>
+                <w:rFonts w:ascii="Calibri" w:hAnsi="Calibri" w:eastAsia="Calibri" w:cs="Arial"/>
+                <w:sz w:val="19"/>
+                <w:lang w:val="de-DE"/>
+                <w:szCs w:val="19"/>
+              </w:rPr>
+              <w:t>✓ (je Teilnehmende gespeichert)</w:t>
+            </w:r>
+          </w:p>
+        </w:tc>
+      </w:tr>
+      <w:tr>
+        <w:tc>
+          <w:tcPr>
+            <w:tcW w:type="dxa" w:w="3137"/>
+          </w:tcPr>
+          <w:p>
+            <w:pPr>
+              <w:spacing w:after="40"/>
+            </w:pPr>
+            <w:r>
+              <w:rPr>
+                <w:rFonts w:ascii="Calibri" w:hAnsi="Calibri" w:eastAsia="Calibri" w:cs="Arial"/>
+                <w:sz w:val="19"/>
+                <w:lang w:val="de-DE"/>
+                <w:szCs w:val="19"/>
+              </w:rPr>
+              <w:t>Teilnehmende und Messungen speichern</w:t>
+            </w:r>
+          </w:p>
+        </w:tc>
+        <w:tc>
+          <w:tcPr>
+            <w:tcW w:type="dxa" w:w="3137"/>
+          </w:tcPr>
+          <w:p>
+            <w:pPr>
+              <w:spacing w:after="40"/>
+            </w:pPr>
+            <w:r>
+              <w:rPr>
+                <w:rFonts w:ascii="Calibri" w:hAnsi="Calibri" w:eastAsia="Calibri" w:cs="Arial"/>
+                <w:sz w:val="19"/>
+                <w:lang w:val="de-DE"/>
+                <w:szCs w:val="19"/>
+              </w:rPr>
+              <w:t>– (nichts wird gespeichert)</w:t>
+            </w:r>
+          </w:p>
+        </w:tc>
+        <w:tc>
+          <w:tcPr>
+            <w:tcW w:type="dxa" w:w="3137"/>
+          </w:tcPr>
+          <w:p>
+            <w:pPr>
+              <w:spacing w:after="40"/>
+            </w:pPr>
+            <w:r>
+              <w:rPr>
+                <w:rFonts w:ascii="Calibri" w:hAnsi="Calibri" w:eastAsia="Calibri" w:cs="Arial"/>
+                <w:sz w:val="19"/>
+                <w:lang w:val="de-DE"/>
+                <w:szCs w:val="19"/>
+              </w:rPr>
+              <w:t>✓ (nur auf diesem Gerät)</w:t>
+            </w:r>
+          </w:p>
+        </w:tc>
+      </w:tr>
+      <w:tr>
+        <w:tc>
+          <w:tcPr>
+            <w:tcW w:type="dxa" w:w="3137"/>
+          </w:tcPr>
+          <w:p>
+            <w:pPr>
+              <w:spacing w:after="40"/>
+            </w:pPr>
+            <w:r>
+              <w:rPr>
+                <w:rFonts w:ascii="Calibri" w:hAnsi="Calibri" w:eastAsia="Calibri" w:cs="Arial"/>
+                <w:sz w:val="19"/>
+                <w:lang w:val="de-DE"/>
+                <w:szCs w:val="19"/>
+              </w:rPr>
+              <w:t>Messreihen vergleichen</w:t>
+            </w:r>
+          </w:p>
+        </w:tc>
+        <w:tc>
+          <w:tcPr>
+            <w:tcW w:type="dxa" w:w="3137"/>
+          </w:tcPr>
+          <w:p>
+            <w:pPr>
+              <w:spacing w:after="40"/>
+            </w:pPr>
+            <w:r>
+              <w:rPr>
+                <w:rFonts w:ascii="Calibri" w:hAnsi="Calibri" w:eastAsia="Calibri" w:cs="Arial"/>
+                <w:sz w:val="19"/>
+                <w:lang w:val="de-DE"/>
+                <w:szCs w:val="19"/>
+              </w:rPr>
+              <w:t>–</w:t>
+            </w:r>
+          </w:p>
+        </w:tc>
+        <w:tc>
+          <w:tcPr>
+            <w:tcW w:type="dxa" w:w="3137"/>
+          </w:tcPr>
+          <w:p>
+            <w:pPr>
+              <w:spacing w:after="40"/>
+            </w:pPr>
+            <w:r>
+              <w:rPr>
+                <w:rFonts w:ascii="Calibri" w:hAnsi="Calibri" w:eastAsia="Calibri" w:cs="Arial"/>
+                <w:sz w:val="19"/>
+                <w:lang w:val="de-DE"/>
+                <w:szCs w:val="19"/>
+              </w:rPr>
+              <w:t>✓</w:t>
+            </w:r>
+          </w:p>
+        </w:tc>
+      </w:tr>
+      <w:tr>
+        <w:tc>
+          <w:tcPr>
+            <w:tcW w:type="dxa" w:w="3137"/>
+          </w:tcPr>
+          <w:p>
+            <w:pPr>
+              <w:spacing w:after="40"/>
+            </w:pPr>
+            <w:r>
+              <w:rPr>
+                <w:rFonts w:ascii="Calibri" w:hAnsi="Calibri" w:eastAsia="Calibri" w:cs="Arial"/>
+                <w:sz w:val="19"/>
+                <w:lang w:val="de-DE"/>
+                <w:szCs w:val="19"/>
+              </w:rPr>
+              <w:t>Export und Import</w:t>
+            </w:r>
+          </w:p>
+        </w:tc>
+        <w:tc>
+          <w:tcPr>
+            <w:tcW w:type="dxa" w:w="3137"/>
+          </w:tcPr>
+          <w:p>
+            <w:pPr>
+              <w:spacing w:after="40"/>
+            </w:pPr>
+            <w:r>
+              <w:rPr>
+                <w:rFonts w:ascii="Calibri" w:hAnsi="Calibri" w:eastAsia="Calibri" w:cs="Arial"/>
+                <w:sz w:val="19"/>
+                <w:lang w:val="de-DE"/>
+                <w:szCs w:val="19"/>
+              </w:rPr>
+              <w:t>–</w:t>
+            </w:r>
+          </w:p>
+        </w:tc>
+        <w:tc>
+          <w:tcPr>
+            <w:tcW w:type="dxa" w:w="3137"/>
+          </w:tcPr>
+          <w:p>
+            <w:pPr>
+              <w:spacing w:after="40"/>
+            </w:pPr>
+            <w:r>
+              <w:rPr>
+                <w:rFonts w:ascii="Calibri" w:hAnsi="Calibri" w:eastAsia="Calibri" w:cs="Arial"/>
+                <w:sz w:val="19"/>
+                <w:lang w:val="de-DE"/>
+                <w:szCs w:val="19"/>
+              </w:rPr>
+              <w:t>✓</w:t>
+            </w:r>
+          </w:p>
+        </w:tc>
+      </w:tr>
+    </w:tbl>
+    <w:p>
+      <w:pPr>
+        <w:spacing w:after="0"/>
+      </w:pPr>
+    </w:p>
+    <w:p>
+      <w:pPr>
+        <w:pStyle w:val="ListBullet"/>
+      </w:pPr>
+      <w:r>
+        <w:rPr>
+          <w:rFonts w:ascii="Calibri" w:hAnsi="Calibri" w:eastAsia="Calibri" w:cs="Arial"/>
+          <w:b/>
+          <w:bCs/>
+          <w:lang w:val="de-DE"/>
+        </w:rPr>
+        <w:t>Freemium</w:t>
+      </w:r>
+      <w:r>
+        <w:rPr>
+          <w:rFonts w:ascii="Calibri" w:hAnsi="Calibri" w:eastAsia="Calibri" w:cs="Arial"/>
+          <w:lang w:val="de-DE"/>
+        </w:rPr>
+        <w:t xml:space="preserve"> ist ohne Anmeldung sofort nutzbar.</w:t>
+      </w:r>
+    </w:p>
+    <w:p>
+      <w:pPr>
+        <w:pStyle w:val="ListBullet"/>
+      </w:pPr>
+      <w:r>
+        <w:rPr>
+          <w:rFonts w:ascii="Calibri" w:hAnsi="Calibri" w:eastAsia="Calibri" w:cs="Arial"/>
+          <w:b/>
+          <w:bCs/>
+          <w:lang w:val="de-DE"/>
+        </w:rPr>
+        <w:t>Studien</w:t>
+      </w:r>
+      <w:r>
+        <w:rPr>
+          <w:rFonts w:ascii="Calibri" w:hAnsi="Calibri" w:eastAsia="Calibri" w:cs="Arial"/>
+          <w:lang w:val="de-DE"/>
+        </w:rPr>
+        <w:t xml:space="preserve"> wird mit einem </w:t>
+      </w:r>
+      <w:r>
+        <w:rPr>
+          <w:rFonts w:ascii="Calibri" w:hAnsi="Calibri" w:eastAsia="Calibri" w:cs="Arial"/>
+          <w:b/>
+          <w:bCs/>
+          <w:lang w:val="de-DE"/>
+        </w:rPr>
+        <w:t>Freischalt-Code</w:t>
+      </w:r>
+      <w:r>
+        <w:rPr>
+          <w:rFonts w:ascii="Calibri" w:hAnsi="Calibri" w:eastAsia="Calibri" w:cs="Arial"/>
+          <w:lang w:val="de-DE"/>
+        </w:rPr>
+        <w:t xml:space="preserve"> freigeschaltet: auf der Übersicht unter </w:t>
+      </w:r>
+      <w:r>
+        <w:rPr>
+          <w:rFonts w:ascii="Calibri" w:hAnsi="Calibri" w:eastAsia="Calibri" w:cs="Arial"/>
+          <w:b/>
+          <w:bCs/>
+          <w:lang w:val="de-DE"/>
+        </w:rPr>
+        <w:t>Version</w:t>
+      </w:r>
+      <w:r>
+        <w:rPr>
+          <w:rFonts w:ascii="Calibri" w:hAnsi="Calibri" w:eastAsia="Calibri" w:cs="Arial"/>
+          <w:lang w:val="de-DE"/>
+        </w:rPr>
+        <w:t xml:space="preserve"> den Code eingeben und </w:t>
+      </w:r>
+      <w:r>
+        <w:rPr>
+          <w:rFonts w:ascii="Calibri" w:hAnsi="Calibri" w:eastAsia="Calibri" w:cs="Arial"/>
+          <w:b/>
+          <w:bCs/>
+          <w:lang w:val="de-DE"/>
+        </w:rPr>
+        <w:t>Freischalten</w:t>
+      </w:r>
+      <w:r>
+        <w:rPr>
+          <w:rFonts w:ascii="Calibri" w:hAnsi="Calibri" w:eastAsia="Calibri" w:cs="Arial"/>
+          <w:lang w:val="de-DE"/>
+        </w:rPr>
+        <w:t xml:space="preserve"> tippen, oder einen Freischalt-Link öffnen. Die Freischaltung gilt auf diesem Gerät und kann ein Ablaufdatum haben.</w:t>
+      </w:r>
+    </w:p>
+    <w:p>
+      <w:pPr>
+        <w:pStyle w:val="ListBullet"/>
+      </w:pPr>
+      <w:r>
+        <w:rPr>
+          <w:rFonts w:ascii="Calibri" w:hAnsi="Calibri" w:eastAsia="Calibri" w:cs="Arial"/>
+          <w:lang w:val="de-DE"/>
+        </w:rPr>
+        <w:t>Läuft eine Freischaltung ab, bleiben gespeicherte Daten auf dem Gerät und lassen sich weiter exportieren. Mit einem neuen Code sind sie wieder zugänglich.</w:t>
+      </w:r>
+    </w:p>
+    <w:p>
+      <w:pPr>
+        <w:pStyle w:val="Heading1"/>
+      </w:pPr>
+      <w:r>
+        <w:rPr>
+          <w:rFonts w:ascii="Calibri" w:hAnsi="Calibri" w:eastAsia="Calibri" w:cs="Arial"/>
+          <w:lang w:val="de-DE"/>
+        </w:rPr>
+        <w:t>5 Gerät einrichten (einmalig)</w:t>
       </w:r>
     </w:p>
     <w:p>
@@ -459,7 +956,7 @@
           <w:rFonts w:ascii="Calibri" w:hAnsi="Calibri" w:eastAsia="Calibri" w:cs="Arial"/>
           <w:lang w:val="de-DE"/>
         </w:rPr>
-        <w:t>Damit das Muster auf jedem Gerät gleich groß und gleich schnell läuft, muss die App wissen, wie groß der Bildschirm ist.</w:t>
+        <w:t>Damit das Reizmuster auf jedem Gerät gleich groß und gleich schnell läuft, muss die App wissen, wie groß der Bildschirm ist.</w:t>
       </w:r>
     </w:p>
     <w:p>
@@ -574,7 +1071,7 @@
           <w:bCs/>
           <w:lang w:val="de-DE"/>
         </w:rPr>
-        <w:t>Karten-Abgleich</w:t>
+        <w:t>Karten-Abgleich zur Ermittlung der Bildschirmauflösung</w:t>
       </w:r>
       <w:r>
         <w:rPr>
@@ -609,7 +1106,7 @@
           <w:rFonts w:ascii="Calibri" w:hAnsi="Calibri" w:eastAsia="Calibri" w:cs="Arial"/>
           <w:lang w:val="de-DE"/>
         </w:rPr>
-        <w:t>Eine Karte im Scheckkartenformat (z. B. Bankkarte, Kundenkarte, Bibliotheksausweis oder Führerschein) flach auf den Bildschirm legen, genau an die markierte Ecke des Rahmens.</w:t>
+        <w:t>Eine Kundenkarte o. ä. in Kreditkartengröße (z. B. Kundenkarte, Bibliotheksausweis, Mitgliedsausweis oder Führerschein) flach auf den Bildschirm legen, genau an die markierte Ecke des Rahmens.</w:t>
       </w:r>
     </w:p>
     <w:p>
@@ -728,7 +1225,7 @@
           <w:rFonts w:ascii="Calibri" w:hAnsi="Calibri" w:eastAsia="Calibri" w:cs="Arial"/>
           <w:lang w:val="de-DE"/>
         </w:rPr>
-        <w:t>5 Personen und Messbedingungen</w:t>
+        <w:t>6 Teilnehmende und Versuchsbedingungen</w:t>
       </w:r>
     </w:p>
     <w:p>
@@ -742,14 +1239,14 @@
           <w:bCs/>
           <w:lang w:val="de-DE"/>
         </w:rPr>
-        <w:t>Person anlegen:</w:t>
+        <w:t>Teilnehmende anlegen</w:t>
       </w:r>
       <w:r>
         <w:rPr>
           <w:rFonts w:ascii="Calibri" w:hAnsi="Calibri" w:eastAsia="Calibri" w:cs="Arial"/>
           <w:lang w:val="de-DE"/>
         </w:rPr>
-        <w:t xml:space="preserve"> nur mit Pseudonym oder Kürzel, z. B. „P01“, nie mit echtem Namen.</w:t>
+        <w:t xml:space="preserve"> (Studien): nur mit Code oder Pseudonym, z. B. „P01“, nie mit echtem Namen.</w:t>
       </w:r>
     </w:p>
     <w:p>
@@ -763,14 +1260,14 @@
           <w:bCs/>
           <w:lang w:val="de-DE"/>
         </w:rPr>
-        <w:t>Messbedingungen</w:t>
+        <w:t>Versuchsbedingungen:</w:t>
       </w:r>
       <w:r>
         <w:rPr>
           <w:rFonts w:ascii="Calibri" w:hAnsi="Calibri" w:eastAsia="Calibri" w:cs="Arial"/>
           <w:lang w:val="de-DE"/>
         </w:rPr>
-        <w:t xml:space="preserve"> werden je Person gespeichert und gelten für alle ihre Messungen:</w:t>
+        <w:t xml:space="preserve"> In Studien werden sie je Teilnehmende gespeichert und gelten für alle ihre Messungen. In Freemium gelten sie nur für die laufende Sitzung.</w:t>
       </w:r>
     </w:p>
     <w:tbl>
@@ -874,7 +1371,7 @@
                 <w:lang w:val="de-DE"/>
                 <w:szCs w:val="19"/>
               </w:rPr>
-              <w:t>Muster</w:t>
+              <w:t>Reizmuster</w:t>
             </w:r>
           </w:p>
         </w:tc>
@@ -1165,7 +1662,7 @@
           <w:rFonts w:ascii="Calibri" w:hAnsi="Calibri" w:eastAsia="Calibri" w:cs="Arial"/>
           <w:lang w:val="de-DE"/>
         </w:rPr>
-        <w:t>Messungen mit anderen Bedingungen zeigt die App getrennt an und vergleicht sie nicht miteinander.</w:t>
+        <w:t>Messungen unter anderen Versuchsbedingungen zeigt die App in einer eigenen Messreihe und vergleicht sie nicht miteinander.</w:t>
       </w:r>
     </w:p>
     <w:p>
@@ -1177,7 +1674,7 @@
           <w:rFonts w:ascii="Calibri" w:hAnsi="Calibri" w:eastAsia="Calibri" w:cs="Arial"/>
           <w:lang w:val="de-DE"/>
         </w:rPr>
-        <w:t>6 Ablauf einer Messung</w:t>
+        <w:t>7 Ablauf einer Messung</w:t>
       </w:r>
     </w:p>
     <w:p>
@@ -1200,7 +1697,7 @@
           <w:bCs/>
           <w:lang w:val="de-DE"/>
         </w:rPr>
-        <w:t>Anweisung vorlesen:</w:t>
+        <w:t>Instruktion vorlesen:</w:t>
       </w:r>
       <w:r>
         <w:rPr>
@@ -1313,7 +1810,7 @@
           <w:rFonts w:ascii="Calibri" w:hAnsi="Calibri" w:eastAsia="Calibri" w:cs="Arial"/>
           <w:lang w:val="de-DE"/>
         </w:rPr>
-        <w:t xml:space="preserve"> Das Muster läuft abwechselnd nach links und rechts, je 3 Runden pro Geschwindigkeit, jede Runde 8 Sekunden. Vor jeder Runde zeigen ein Kreuz und ein Pfeil die nächste Richtung. </w:t>
+        <w:t xml:space="preserve"> Das Reizmuster läuft abwechselnd nach links und rechts, je 3 Durchgänge pro Geschwindigkeit, jeder Durchgang 8 Sekunden. Vor jedem Durchgang zeigen ein Kreuz und ein Pfeil die nächste Richtung. </w:t>
       </w:r>
       <w:r>
         <w:rPr>
@@ -1329,7 +1826,7 @@
           <w:rFonts w:ascii="Calibri" w:hAnsi="Calibri" w:eastAsia="Calibri" w:cs="Arial"/>
           <w:lang w:val="de-DE"/>
         </w:rPr>
-        <w:t xml:space="preserve"> pausiert. Ungültige Runden (zu wenige erkannte Bilder oder zu viel Wackeln) wiederholt die App am Ende einmal automatisch.</w:t>
+        <w:t xml:space="preserve"> pausiert. Ungültige Durchgänge (zu wenige erkannte Bilder oder zu viel Kopfbewegung) wiederholt die App am Ende einmal automatisch.</w:t>
       </w:r>
     </w:p>
     <w:p>
@@ -1359,7 +1856,7 @@
           <w:rFonts w:ascii="Calibri" w:hAnsi="Calibri" w:eastAsia="Calibri" w:cs="Arial"/>
           <w:lang w:val="de-DE"/>
         </w:rPr>
-        <w:t xml:space="preserve"> erscheint sofort und wird auf dem Gerät gespeichert.</w:t>
+        <w:t xml:space="preserve"> erscheint sofort. In Studien wird es auf dem Gerät gespeichert, in Freemium nicht.</w:t>
       </w:r>
     </w:p>
     <w:p>
@@ -1380,7 +1877,7 @@
           <w:rFonts w:ascii="Calibri" w:hAnsi="Calibri" w:eastAsia="Calibri" w:cs="Arial"/>
           <w:lang w:val="de-DE"/>
         </w:rPr>
-        <w:t>7 Das Ergebnis verstehen</w:t>
+        <w:t>8 Das Ergebnis verstehen</w:t>
       </w:r>
     </w:p>
     <w:p>
@@ -1389,7 +1886,7 @@
           <w:rFonts w:ascii="Calibri" w:hAnsi="Calibri" w:eastAsia="Calibri" w:cs="Arial"/>
           <w:lang w:val="de-DE"/>
         </w:rPr>
-        <w:t>Das Ergebnis besteht aus bis zu drei Kacheln. Die Werte beschreiben, wie die Augen dem Muster gefolgt sind. Sie sind eine Beobachtung, keine Bewertung.</w:t>
+        <w:t>Das Ergebnis besteht aus bis zu drei Kacheln. Die Werte beschreiben, wie die Augen dem Reizmuster gefolgt sind. Sie sind eine Beobachtung, keine Bewertung.</w:t>
       </w:r>
     </w:p>
     <w:p>
@@ -1510,7 +2007,7 @@
           <w:rFonts w:ascii="Calibri" w:hAnsi="Calibri" w:eastAsia="Calibri" w:cs="Arial"/>
           <w:lang w:val="de-DE"/>
         </w:rPr>
-        <w:t>Der Gain hängt unter anderem davon ab, wie aufmerksam und auf welche Weise jemand hinschaut, sowie von Licht und Abstand. Deshalb sind nur Messungen derselben Person unter gleichen Bedingungen vergleichbar.</w:t>
+        <w:t>Der Gain hängt unter anderem davon ab, wie aufmerksam und auf welche Weise jemand hinschaut, sowie von Licht und Abstand. Deshalb sind nur Messungen derselben Person unter gleichen Versuchsbedingungen vergleichbar.</w:t>
       </w:r>
     </w:p>
     <w:p>
@@ -1662,7 +2159,7 @@
           <w:rFonts w:ascii="Calibri" w:hAnsi="Calibri" w:eastAsia="Calibri" w:cs="Arial"/>
           <w:lang w:val="de-DE"/>
         </w:rPr>
-        <w:t>Die Grenze von 10 % ist eine Festlegung der App. Licht, Kopfhaltung, Abstand und das Gerät selbst (die Kamera sitzt nicht genau in der Mitte) können solche Unterschiede beeinflussen. Aussagekräftig ist die Veränderung bei späteren Messungen.</w:t>
+        <w:t>Die Grenze von 10 % ist eine Festlegung der App. Licht, Kopfhaltung, Abstand und das Gerät selbst (die Kamera sitzt nicht genau in der Mitte) können solche Unterschiede beeinflussen. Aussagekräftig ist der Vergleich mehrerer Messungen.</w:t>
       </w:r>
     </w:p>
     <w:p>
@@ -1683,7 +2180,7 @@
           <w:rFonts w:ascii="Calibri" w:hAnsi="Calibri" w:eastAsia="Calibri" w:cs="Arial"/>
           <w:lang w:val="de-DE"/>
         </w:rPr>
-        <w:t>Nur bei senkrechter Messung, berechnet wie rechts/links. Ein Vorteil nach oben kommt häufig vor, und senkrechte Unterschiede sind von Person zu Person verschieden. Aussagekräftig ist die Veränderung gegenüber den eigenen früheren Messungen.</w:t>
+        <w:t>Nur bei senkrechter Messung, berechnet wie rechts/links. Ein Vorteil nach oben kommt häufig vor, und senkrechte Unterschiede sind von Person zu Person verschieden. Aussagekräftig ist der Vergleich mit eigenen früheren Messungen.</w:t>
       </w:r>
     </w:p>
     <w:p>
@@ -1720,7 +2217,7 @@
           <w:rFonts w:ascii="Calibri" w:hAnsi="Calibri" w:eastAsia="Calibri" w:cs="Arial"/>
           <w:lang w:val="de-DE"/>
         </w:rPr>
-        <w:t xml:space="preserve"> stehen alle Runden mit Richtung, Geschwindigkeit, Gain, dem Anteil erkannter Bilder, dem Anteil mit Wackeln und der Qualität, dazu eine Kurve der Augenbewegung.</w:t>
+        <w:t xml:space="preserve"> stehen alle Durchgänge mit Richtung, Geschwindigkeit, Gain, dem Anteil erkannter Bilder, dem Anteil mit Kopfbewegung und der Qualität, dazu die Augenspur als Kurve.</w:t>
       </w:r>
     </w:p>
     <w:tbl>
@@ -1819,7 +2316,7 @@
                 <w:lang w:val="de-DE"/>
                 <w:szCs w:val="19"/>
               </w:rPr>
-              <w:t>mindestens 70 % der Bilder mit erkannten Augen und höchstens 20 % Wackeln</w:t>
+              <w:t>mindestens 70 % der Bilder mit erkannten Augen und höchstens 20 % Kopfbewegung</w:t>
             </w:r>
           </w:p>
         </w:tc>
@@ -1899,7 +2396,7 @@
                 <w:lang w:val="de-DE"/>
                 <w:szCs w:val="19"/>
               </w:rPr>
-              <w:t>alles darunter; diese Runde zählt nicht</w:t>
+              <w:t>alles darunter; dieser Durchgang zählt nicht</w:t>
             </w:r>
           </w:p>
         </w:tc>
@@ -1919,7 +2416,7 @@
           <w:rFonts w:ascii="Calibri" w:hAnsi="Calibri" w:eastAsia="Calibri" w:cs="Arial"/>
           <w:lang w:val="de-DE"/>
         </w:rPr>
-        <w:t>Ausgangsmessung und Veränderung</w:t>
+        <w:t>Erste Messung und Vergleich (Studien)</w:t>
       </w:r>
     </w:p>
     <w:p>
@@ -1928,7 +2425,7 @@
           <w:rFonts w:ascii="Calibri" w:hAnsi="Calibri" w:eastAsia="Calibri" w:cs="Arial"/>
           <w:lang w:val="de-DE"/>
         </w:rPr>
-        <w:t xml:space="preserve">Die erste Messung einer Person unter bestimmten Bedingungen ist ihre </w:t>
+        <w:t xml:space="preserve">Die </w:t>
       </w:r>
       <w:r>
         <w:rPr>
@@ -1937,14 +2434,14 @@
           <w:bCs/>
           <w:lang w:val="de-DE"/>
         </w:rPr>
-        <w:t>Ausgangsmessung</w:t>
+        <w:t>erste Messung</w:t>
       </w:r>
       <w:r>
         <w:rPr>
           <w:rFonts w:ascii="Calibri" w:hAnsi="Calibri" w:eastAsia="Calibri" w:cs="Arial"/>
           <w:lang w:val="de-DE"/>
         </w:rPr>
-        <w:t>. Bei jeder weiteren Messung zeigt die App die Veränderung dazu. Auf der Seite der Person stehen alle Messungen als Diagramme und Tabelle.</w:t>
+        <w:t xml:space="preserve"> von Teilnehmenden unter bestimmten Versuchsbedingungen ist der Bezugspunkt. Bei jeder weiteren Messung zeigt die App den Unterschied zur ersten Messung. Auf der Seite der Teilnehmenden stehen alle Messungen als Messreihe mit Diagrammen und Tabelle.</w:t>
       </w:r>
     </w:p>
     <w:p>
@@ -1956,7 +2453,7 @@
           <w:rFonts w:ascii="Calibri" w:hAnsi="Calibri" w:eastAsia="Calibri" w:cs="Arial"/>
           <w:lang w:val="de-DE"/>
         </w:rPr>
-        <w:t>8 Tipps für vergleichbare Messungen</w:t>
+        <w:t>9 Tipps für vergleichbare Messungen</w:t>
       </w:r>
     </w:p>
     <w:p>
@@ -1968,7 +2465,7 @@
           <w:rFonts w:ascii="Calibri" w:hAnsi="Calibri" w:eastAsia="Calibri" w:cs="Arial"/>
           <w:lang w:val="de-DE"/>
         </w:rPr>
-        <w:t>Gleiches Gerät, gleicher Abstand, gleiche Messbedingungen.</w:t>
+        <w:t>Gleiches Gerät, gleicher Abstand, gleiche Versuchsbedingungen.</w:t>
       </w:r>
     </w:p>
     <w:p>
@@ -1980,7 +2477,7 @@
           <w:rFonts w:ascii="Calibri" w:hAnsi="Calibri" w:eastAsia="Calibri" w:cs="Arial"/>
           <w:lang w:val="de-DE"/>
         </w:rPr>
-        <w:t>Die Anweisung jedes Mal wörtlich vorlesen.</w:t>
+        <w:t>Die Instruktion jedes Mal wörtlich vorlesen.</w:t>
       </w:r>
     </w:p>
     <w:p>
@@ -2016,7 +2513,7 @@
           <w:rFonts w:ascii="Calibri" w:hAnsi="Calibri" w:eastAsia="Calibri" w:cs="Arial"/>
           <w:lang w:val="de-DE"/>
         </w:rPr>
-        <w:t>Zu Beginn mehrere Ausgangsmessungen an verschiedenen Tagen machen. So zeigt sich, wie stark die eigenen Werte von Tag zu Tag schwanken.</w:t>
+        <w:t>Zu Beginn an mehreren verschiedenen Tagen messen. So zeigt sich, wie stark die eigenen Werte von Tag zu Tag schwanken.</w:t>
       </w:r>
     </w:p>
     <w:p>
@@ -2028,7 +2525,7 @@
           <w:rFonts w:ascii="Calibri" w:hAnsi="Calibri" w:eastAsia="Calibri" w:cs="Arial"/>
           <w:lang w:val="de-DE"/>
         </w:rPr>
-        <w:t>Nur Runden mit guter Qualität vergleichen.</w:t>
+        <w:t>Nur Durchgänge mit guter Qualität vergleichen.</w:t>
       </w:r>
     </w:p>
     <w:p>
@@ -2040,7 +2537,7 @@
           <w:rFonts w:ascii="Calibri" w:hAnsi="Calibri" w:eastAsia="Calibri" w:cs="Arial"/>
           <w:lang w:val="de-DE"/>
         </w:rPr>
-        <w:t>9 Grenzen</w:t>
+        <w:t>10 Grenzen</w:t>
       </w:r>
     </w:p>
     <w:p>
@@ -2100,7 +2597,7 @@
           <w:rFonts w:ascii="Calibri" w:hAnsi="Calibri" w:eastAsia="Calibri" w:cs="Arial"/>
           <w:lang w:val="de-DE"/>
         </w:rPr>
-        <w:t>10 Daten und Datenschutz</w:t>
+        <w:t>11 Daten und Datenschutz</w:t>
       </w:r>
     </w:p>
     <w:p>
@@ -2112,7 +2609,49 @@
           <w:rFonts w:ascii="Calibri" w:hAnsi="Calibri" w:eastAsia="Calibri" w:cs="Arial"/>
           <w:lang w:val="de-DE"/>
         </w:rPr>
-        <w:t xml:space="preserve">Alle Messungen bleiben </w:t>
+        <w:t>Kamerabilder verlassen nie das Gerät. Die App sendet nichts an einen Server und speichert kein Video.</w:t>
+      </w:r>
+    </w:p>
+    <w:p>
+      <w:pPr>
+        <w:pStyle w:val="ListBullet"/>
+      </w:pPr>
+      <w:r>
+        <w:rPr>
+          <w:rFonts w:ascii="Calibri" w:hAnsi="Calibri" w:eastAsia="Calibri" w:cs="Arial"/>
+          <w:b/>
+          <w:bCs/>
+          <w:lang w:val="de-DE"/>
+        </w:rPr>
+        <w:t>Freemium</w:t>
+      </w:r>
+      <w:r>
+        <w:rPr>
+          <w:rFonts w:ascii="Calibri" w:hAnsi="Calibri" w:eastAsia="Calibri" w:cs="Arial"/>
+          <w:lang w:val="de-DE"/>
+        </w:rPr>
+        <w:t xml:space="preserve"> speichert keine Teilnehmenden und keine Messungen. Gespeichert werden nur Einstellungen wie Sprache und Geräte-Einrichtung.</w:t>
+      </w:r>
+    </w:p>
+    <w:p>
+      <w:pPr>
+        <w:pStyle w:val="ListBullet"/>
+      </w:pPr>
+      <w:r>
+        <w:rPr>
+          <w:rFonts w:ascii="Calibri" w:hAnsi="Calibri" w:eastAsia="Calibri" w:cs="Arial"/>
+          <w:b/>
+          <w:bCs/>
+          <w:lang w:val="de-DE"/>
+        </w:rPr>
+        <w:t>Studien</w:t>
+      </w:r>
+      <w:r>
+        <w:rPr>
+          <w:rFonts w:ascii="Calibri" w:hAnsi="Calibri" w:eastAsia="Calibri" w:cs="Arial"/>
+          <w:lang w:val="de-DE"/>
+        </w:rPr>
+        <w:t xml:space="preserve"> speichert Teilnehmende (nur mit Code oder Pseudonym) und Messungen </w:t>
       </w:r>
       <w:r>
         <w:rPr>
@@ -2128,12 +2667,12 @@
           <w:rFonts w:ascii="Calibri" w:hAnsi="Calibri" w:eastAsia="Calibri" w:cs="Arial"/>
           <w:lang w:val="de-DE"/>
         </w:rPr>
-        <w:t>. Die App sendet nichts an einen Server und speichert kein Video.</w:t>
+        <w:t>.</w:t>
       </w:r>
     </w:p>
     <w:p>
       <w:pPr>
-        <w:pStyle w:val="ListBullet"/>
+        <w:pStyle w:val="ListBullet2"/>
       </w:pPr>
       <w:r>
         <w:rPr>
@@ -2154,7 +2693,7 @@
     </w:p>
     <w:p>
       <w:pPr>
-        <w:pStyle w:val="ListBullet"/>
+        <w:pStyle w:val="ListBullet2"/>
       </w:pPr>
       <w:r>
         <w:rPr>
@@ -2175,7 +2714,7 @@
     </w:p>
     <w:p>
       <w:pPr>
-        <w:pStyle w:val="ListBullet"/>
+        <w:pStyle w:val="ListBullet2"/>
       </w:pPr>
       <w:r>
         <w:rPr>
@@ -2194,7 +2733,7 @@
           <w:rFonts w:ascii="Calibri" w:hAnsi="Calibri" w:eastAsia="Calibri" w:cs="Arial"/>
           <w:lang w:val="de-DE"/>
         </w:rPr>
-        <w:t>11 Wenn etwas nicht klappt</w:t>
+        <w:t>12 Wenn etwas nicht klappt</w:t>
       </w:r>
     </w:p>
     <w:tbl>
@@ -2454,6 +2993,46 @@
                 <w:lang w:val="de-DE"/>
                 <w:szCs w:val="19"/>
               </w:rPr>
+              <w:t>Freischalt-Code wird nicht angenommen</w:t>
+            </w:r>
+          </w:p>
+        </w:tc>
+        <w:tc>
+          <w:tcPr>
+            <w:tcW w:type="dxa" w:w="4706"/>
+          </w:tcPr>
+          <w:p>
+            <w:pPr>
+              <w:spacing w:after="40"/>
+            </w:pPr>
+            <w:r>
+              <w:rPr>
+                <w:rFonts w:ascii="Calibri" w:hAnsi="Calibri" w:eastAsia="Calibri" w:cs="Arial"/>
+                <w:sz w:val="19"/>
+                <w:lang w:val="de-DE"/>
+                <w:szCs w:val="19"/>
+              </w:rPr>
+              <w:t>Code genau so eingeben, wie er mitgeteilt wurde (Groß- und Kleinschreibung und Bindestriche spielen keine Rolle). Abgelaufene Codes gelten nicht mehr.</w:t>
+            </w:r>
+          </w:p>
+        </w:tc>
+      </w:tr>
+      <w:tr>
+        <w:tc>
+          <w:tcPr>
+            <w:tcW w:type="dxa" w:w="4706"/>
+          </w:tcPr>
+          <w:p>
+            <w:pPr>
+              <w:spacing w:after="40"/>
+            </w:pPr>
+            <w:r>
+              <w:rPr>
+                <w:rFonts w:ascii="Calibri" w:hAnsi="Calibri" w:eastAsia="Calibri" w:cs="Arial"/>
+                <w:sz w:val="19"/>
+                <w:lang w:val="de-DE"/>
+                <w:szCs w:val="19"/>
+              </w:rPr>
               <w:t>Leere Seite</w:t>
             </w:r>
           </w:p>
@@ -2497,7 +3076,7 @@
           <w:rFonts w:ascii="Calibri" w:hAnsi="Calibri" w:eastAsia="Calibri" w:cs="Arial"/>
           <w:lang w:val="de-DE"/>
         </w:rPr>
-        <w:t>Wellness-Anwendung, kein Medizinprodukt. Sie dient nicht der Erkennung, Überwachung oder Behandlung von Krankheiten und ersetzt keine ärztliche Untersuchung.</w:t>
+        <w:t>Eye Reflex Lab ist eine Wellness- und Lehranwendung, kein Medizinprodukt. Sie dient nicht der Erkennung, Überwachung oder Behandlung von Krankheiten und ersetzt keine ärztliche Untersuchung.</w:t>
       </w:r>
     </w:p>
     <w:sectPr>
@@ -2526,7 +3105,7 @@
         <w:lang w:val="de-DE"/>
         <w:szCs w:val="17"/>
       </w:rPr>
-      <w:t xml:space="preserve">OKR-Schnellcheck · Anleitung · Seite </w:t>
+      <w:t xml:space="preserve">Eye Reflex Lab · Anleitung · Seite </w:t>
     </w:r>
     <w:r>
       <w:rPr>

</xml_diff>

<commit_message>
Augenspur: vergrößerte Augen aus Gesichtspunkten, Striche, Kurve in Grad und mm; Version 2.4.0
- Aufzeichnung: je Kamerabild 17 Gesichtspunkte pro Auge (Augenwinkel, Lidrand, Iris), keine Bilder
  (eyeTrace in der Messung, ca. 0,5–1 MB); js/eyetrace.js mit Tests (test/eyetrace.test.js)
- Anzeige (js/eyeview.js): nachgezeichnete, gespiegelte Augen, Striche für Mitgleiten und Rücksprung
  (in Laufrichtung vergrößert, Faktor angezeigt), Kurve mit Zeitstrich, Werte in Grad und mm
  (mm über den Irisdurchmesser 11,7 mm), Messschwankung je Bild
- Freemium: Standbild eines Durchgangs; Studien: Abspielen in Zeitlupe, Zeitregler, Wahl des Durchgangs
- Anleitung de/en/he, README, CLAUDE.md; Geheimnis-Wächter erkennt Freischalt-Codes

Co-Authored-By: Claude Opus 5.5 <noreply@anthropic.com>
</commit_message>
<xml_diff>
--- a/docs/guide_de.docx
+++ b/docs/guide_de.docx
@@ -29,7 +29,7 @@
           <w:rFonts w:ascii="Calibri" w:hAnsi="Calibri" w:eastAsia="Calibri" w:cs="Arial"/>
           <w:lang w:val="de-DE"/>
         </w:rPr>
-        <w:t xml:space="preserve"> · Stand: 24. Oktober 2026 · App-Version 2.3 · </w:t>
+        <w:t xml:space="preserve"> · Stand: 24. Oktober 2026 · App-Version 2.4 · </w:t>
       </w:r>
       <w:hyperlink r:id="rId9">
         <w:r>
@@ -708,6 +708,65 @@
                 <w:szCs w:val="19"/>
               </w:rPr>
               <w:t>✓ (nur auf diesem Gerät)</w:t>
+            </w:r>
+          </w:p>
+        </w:tc>
+      </w:tr>
+      <w:tr>
+        <w:tc>
+          <w:tcPr>
+            <w:tcW w:type="dxa" w:w="3137"/>
+          </w:tcPr>
+          <w:p>
+            <w:pPr>
+              <w:spacing w:after="40"/>
+            </w:pPr>
+            <w:r>
+              <w:rPr>
+                <w:rFonts w:ascii="Calibri" w:hAnsi="Calibri" w:eastAsia="Calibri" w:cs="Arial"/>
+                <w:sz w:val="19"/>
+                <w:lang w:val="de-DE"/>
+                <w:szCs w:val="19"/>
+              </w:rPr>
+              <w:t>Augenspur</w:t>
+            </w:r>
+          </w:p>
+        </w:tc>
+        <w:tc>
+          <w:tcPr>
+            <w:tcW w:type="dxa" w:w="3137"/>
+          </w:tcPr>
+          <w:p>
+            <w:pPr>
+              <w:spacing w:after="40"/>
+            </w:pPr>
+            <w:r>
+              <w:rPr>
+                <w:rFonts w:ascii="Calibri" w:hAnsi="Calibri" w:eastAsia="Calibri" w:cs="Arial"/>
+                <w:sz w:val="19"/>
+                <w:lang w:val="de-DE"/>
+                <w:szCs w:val="19"/>
+              </w:rPr>
+              <w:t>Standbild eines Durchgangs</w:t>
+            </w:r>
+          </w:p>
+        </w:tc>
+        <w:tc>
+          <w:tcPr>
+            <w:tcW w:type="dxa" w:w="3137"/>
+          </w:tcPr>
+          <w:p>
+            <w:pPr>
+              <w:spacing w:after="40"/>
+            </w:pPr>
+            <w:r>
+              <w:rPr>
+                <w:rFonts w:ascii="Calibri" w:hAnsi="Calibri" w:eastAsia="Calibri" w:cs="Arial"/>
+                <w:sz w:val="19"/>
+                <w:lang w:val="de-DE"/>
+                <w:szCs w:val="19"/>
+              </w:rPr>
+              <w:t>Abspielen in Zeitlupe, alle Durchgänge, gespeichert</w:t>
             </w:r>
           </w:p>
         </w:tc>
@@ -2217,7 +2276,7 @@
           <w:rFonts w:ascii="Calibri" w:hAnsi="Calibri" w:eastAsia="Calibri" w:cs="Arial"/>
           <w:lang w:val="de-DE"/>
         </w:rPr>
-        <w:t xml:space="preserve"> stehen alle Durchgänge mit Richtung, Geschwindigkeit, Gain, dem Anteil erkannter Bilder, dem Anteil mit Kopfbewegung und der Qualität, dazu die Augenspur als Kurve.</w:t>
+        <w:t xml:space="preserve"> stehen alle Durchgänge mit Richtung, Geschwindigkeit, Gain, dem Anteil erkannter Bilder, dem Anteil mit Kopfbewegung und der Qualität.</w:t>
       </w:r>
     </w:p>
     <w:tbl>
@@ -2416,6 +2475,245 @@
           <w:rFonts w:ascii="Calibri" w:hAnsi="Calibri" w:eastAsia="Calibri" w:cs="Arial"/>
           <w:lang w:val="de-DE"/>
         </w:rPr>
+        <w:t>Augenspur</w:t>
+      </w:r>
+    </w:p>
+    <w:p>
+      <w:r>
+        <w:rPr>
+          <w:rFonts w:ascii="Calibri" w:hAnsi="Calibri" w:eastAsia="Calibri" w:cs="Arial"/>
+          <w:lang w:val="de-DE"/>
+        </w:rPr>
+        <w:t xml:space="preserve">Unter dem Ergebnis zeigt die App die </w:t>
+      </w:r>
+      <w:r>
+        <w:rPr>
+          <w:rFonts w:ascii="Calibri" w:hAnsi="Calibri" w:eastAsia="Calibri" w:cs="Arial"/>
+          <w:b/>
+          <w:bCs/>
+          <w:lang w:val="de-DE"/>
+        </w:rPr>
+        <w:t>Augenspur</w:t>
+      </w:r>
+      <w:r>
+        <w:rPr>
+          <w:rFonts w:ascii="Calibri" w:hAnsi="Calibri" w:eastAsia="Calibri" w:cs="Arial"/>
+          <w:lang w:val="de-DE"/>
+        </w:rPr>
+        <w:t xml:space="preserve"> eines Durchgangs:</w:t>
+      </w:r>
+    </w:p>
+    <w:p>
+      <w:pPr>
+        <w:pStyle w:val="ListBullet"/>
+      </w:pPr>
+      <w:r>
+        <w:rPr>
+          <w:rFonts w:ascii="Calibri" w:hAnsi="Calibri" w:eastAsia="Calibri" w:cs="Arial"/>
+          <w:b/>
+          <w:bCs/>
+          <w:lang w:val="de-DE"/>
+        </w:rPr>
+        <w:t>Vergrößerte Augen</w:t>
+      </w:r>
+      <w:r>
+        <w:rPr>
+          <w:rFonts w:ascii="Calibri" w:hAnsi="Calibri" w:eastAsia="Calibri" w:cs="Arial"/>
+          <w:lang w:val="de-DE"/>
+        </w:rPr>
+        <w:t>, nachgezeichnet aus den Gesichtspunkten, die die Gesichtserkennung je Bild liefert (Augenwinkel, Lidrand, Iris). Es wird kein Kamerabild gezeigt oder gespeichert. Die Ansicht ist gespiegelt wie in einem Spiegel: Läuft das Reizmuster nach rechts, bewegen sich die Augen in der Ansicht nach rechts.</w:t>
+      </w:r>
+    </w:p>
+    <w:p>
+      <w:pPr>
+        <w:pStyle w:val="ListBullet"/>
+      </w:pPr>
+      <w:r>
+        <w:rPr>
+          <w:rFonts w:ascii="Calibri" w:hAnsi="Calibri" w:eastAsia="Calibri" w:cs="Arial"/>
+          <w:b/>
+          <w:bCs/>
+          <w:lang w:val="de-DE"/>
+        </w:rPr>
+        <w:t>Striche:</w:t>
+      </w:r>
+      <w:r>
+        <w:rPr>
+          <w:rFonts w:ascii="Calibri" w:hAnsi="Calibri" w:eastAsia="Calibri" w:cs="Arial"/>
+          <w:lang w:val="de-DE"/>
+        </w:rPr>
+        <w:t xml:space="preserve"> Die Bewegung der Iris der letzten gut einer Sekunde läuft wie bei einem Schreiber als Spur nach unten weg. Das </w:t>
+      </w:r>
+      <w:r>
+        <w:rPr>
+          <w:rFonts w:ascii="Calibri" w:hAnsi="Calibri" w:eastAsia="Calibri" w:cs="Arial"/>
+          <w:b/>
+          <w:bCs/>
+          <w:lang w:val="de-DE"/>
+        </w:rPr>
+        <w:t>Mitgleiten</w:t>
+      </w:r>
+      <w:r>
+        <w:rPr>
+          <w:rFonts w:ascii="Calibri" w:hAnsi="Calibri" w:eastAsia="Calibri" w:cs="Arial"/>
+          <w:lang w:val="de-DE"/>
+        </w:rPr>
+        <w:t xml:space="preserve"> (langsame Phase, blau) erscheint als schräger Strich, der </w:t>
+      </w:r>
+      <w:r>
+        <w:rPr>
+          <w:rFonts w:ascii="Calibri" w:hAnsi="Calibri" w:eastAsia="Calibri" w:cs="Arial"/>
+          <w:b/>
+          <w:bCs/>
+          <w:lang w:val="de-DE"/>
+        </w:rPr>
+        <w:t>Rücksprung</w:t>
+      </w:r>
+      <w:r>
+        <w:rPr>
+          <w:rFonts w:ascii="Calibri" w:hAnsi="Calibri" w:eastAsia="Calibri" w:cs="Arial"/>
+          <w:lang w:val="de-DE"/>
+        </w:rPr>
+        <w:t xml:space="preserve"> (schnelle Phase, orange) als kurzer Gegenstrich. Weil die Bewegung nur Bruchteile eines Millimeters beträgt, sind die Striche in Laufrichtung vergrößert; der Faktor steht im Bild.</w:t>
+      </w:r>
+    </w:p>
+    <w:p>
+      <w:pPr>
+        <w:pStyle w:val="ListBullet"/>
+      </w:pPr>
+      <w:r>
+        <w:rPr>
+          <w:rFonts w:ascii="Calibri" w:hAnsi="Calibri" w:eastAsia="Calibri" w:cs="Arial"/>
+          <w:b/>
+          <w:bCs/>
+          <w:lang w:val="de-DE"/>
+        </w:rPr>
+        <w:t>Kurve:</w:t>
+      </w:r>
+      <w:r>
+        <w:rPr>
+          <w:rFonts w:ascii="Calibri" w:hAnsi="Calibri" w:eastAsia="Calibri" w:cs="Arial"/>
+          <w:lang w:val="de-DE"/>
+        </w:rPr>
+        <w:t xml:space="preserve"> die Augenposition über die Zeit mit Zeitstrich, links in Grad, rechts in mm.</w:t>
+      </w:r>
+    </w:p>
+    <w:p>
+      <w:pPr>
+        <w:pStyle w:val="ListBullet"/>
+      </w:pPr>
+      <w:r>
+        <w:rPr>
+          <w:rFonts w:ascii="Calibri" w:hAnsi="Calibri" w:eastAsia="Calibri" w:cs="Arial"/>
+          <w:b/>
+          <w:bCs/>
+          <w:lang w:val="de-DE"/>
+        </w:rPr>
+        <w:t>Werte:</w:t>
+      </w:r>
+      <w:r>
+        <w:rPr>
+          <w:rFonts w:ascii="Calibri" w:hAnsi="Calibri" w:eastAsia="Calibri" w:cs="Arial"/>
+          <w:lang w:val="de-DE"/>
+        </w:rPr>
+        <w:t xml:space="preserve"> Mitgleiten in °/s und mm/s, mittlerer Rücksprung in Grad und mm, dazu die Messschwankung je Bild.</w:t>
+      </w:r>
+    </w:p>
+    <w:p>
+      <w:pPr>
+        <w:pStyle w:val="ListBullet"/>
+      </w:pPr>
+      <w:r>
+        <w:rPr>
+          <w:rFonts w:ascii="Calibri" w:hAnsi="Calibri" w:eastAsia="Calibri" w:cs="Arial"/>
+          <w:b/>
+          <w:bCs/>
+          <w:lang w:val="de-DE"/>
+        </w:rPr>
+        <w:t>Grad und mm:</w:t>
+      </w:r>
+      <w:r>
+        <w:rPr>
+          <w:rFonts w:ascii="Calibri" w:hAnsi="Calibri" w:eastAsia="Calibri" w:cs="Arial"/>
+          <w:lang w:val="de-DE"/>
+        </w:rPr>
+        <w:t xml:space="preserve"> Grad stammen aus der Kalibrierung. Millimeter schätzt die App über den Irisdurchmesser, der bei Erwachsenen bei etwa 11,7 mm liegt. Einzelne Bilder schwanken etwa um die angezeigte Messschwankung; Werte über viele Bilder sind genauer.</w:t>
+      </w:r>
+    </w:p>
+    <w:p>
+      <w:pPr>
+        <w:pStyle w:val="ListBullet"/>
+      </w:pPr>
+      <w:r>
+        <w:rPr>
+          <w:rFonts w:ascii="Calibri" w:hAnsi="Calibri" w:eastAsia="Calibri" w:cs="Arial"/>
+          <w:b/>
+          <w:bCs/>
+          <w:lang w:val="de-DE"/>
+        </w:rPr>
+        <w:t>Freemium:</w:t>
+      </w:r>
+      <w:r>
+        <w:rPr>
+          <w:rFonts w:ascii="Calibri" w:hAnsi="Calibri" w:eastAsia="Calibri" w:cs="Arial"/>
+          <w:lang w:val="de-DE"/>
+        </w:rPr>
+        <w:t xml:space="preserve"> Standbild eines Durchgangs als Vorgeschmack. </w:t>
+      </w:r>
+      <w:r>
+        <w:rPr>
+          <w:rFonts w:ascii="Calibri" w:hAnsi="Calibri" w:eastAsia="Calibri" w:cs="Arial"/>
+          <w:b/>
+          <w:bCs/>
+          <w:lang w:val="de-DE"/>
+        </w:rPr>
+        <w:t>Studien:</w:t>
+      </w:r>
+      <w:r>
+        <w:rPr>
+          <w:rFonts w:ascii="Calibri" w:hAnsi="Calibri" w:eastAsia="Calibri" w:cs="Arial"/>
+          <w:lang w:val="de-DE"/>
+        </w:rPr>
+        <w:t xml:space="preserve"> Abspielen in Zeitlupe (¼×, ½×, 1×), Zeitregler, Wahl des Durchgangs; die Augenspur wird mit der Messung gespeichert und lässt sich jederzeit wieder ansehen.</w:t>
+      </w:r>
+    </w:p>
+    <w:p>
+      <w:pPr>
+        <w:pStyle w:val="ListBullet"/>
+      </w:pPr>
+      <w:r>
+        <w:rPr>
+          <w:rFonts w:ascii="Calibri" w:hAnsi="Calibri" w:eastAsia="Calibri" w:cs="Arial"/>
+          <w:lang w:val="de-DE"/>
+        </w:rPr>
+        <w:t xml:space="preserve">Die Augenspur gibt es für Messungen ab App-Version 2.4. Ältere Messungen zeigen unter </w:t>
+      </w:r>
+      <w:r>
+        <w:rPr>
+          <w:rFonts w:ascii="Calibri" w:hAnsi="Calibri" w:eastAsia="Calibri" w:cs="Arial"/>
+          <w:b/>
+          <w:bCs/>
+          <w:lang w:val="de-DE"/>
+        </w:rPr>
+        <w:t>Details</w:t>
+      </w:r>
+      <w:r>
+        <w:rPr>
+          <w:rFonts w:ascii="Calibri" w:hAnsi="Calibri" w:eastAsia="Calibri" w:cs="Arial"/>
+          <w:lang w:val="de-DE"/>
+        </w:rPr>
+        <w:t xml:space="preserve"> eine Kurve in Grad.</w:t>
+      </w:r>
+    </w:p>
+    <w:p>
+      <w:pPr>
+        <w:pStyle w:val="Heading2"/>
+      </w:pPr>
+      <w:r>
+        <w:rPr>
+          <w:rFonts w:ascii="Calibri" w:hAnsi="Calibri" w:eastAsia="Calibri" w:cs="Arial"/>
+          <w:lang w:val="de-DE"/>
+        </w:rPr>
         <w:t>Erste Messung und Vergleich (Studien)</w:t>
       </w:r>
     </w:p>
@@ -2561,6 +2859,18 @@
           <w:rFonts w:ascii="Calibri" w:hAnsi="Calibri" w:eastAsia="Calibri" w:cs="Arial"/>
           <w:lang w:val="de-DE"/>
         </w:rPr>
+        <w:t>Die mm-Werte der Augenspur beruhen auf einem durchschnittlichen Irisdurchmesser. Bei einzelnen Personen kann er etwas abweichen; für den Vergleich derselben Person spielt das keine Rolle.</w:t>
+      </w:r>
+    </w:p>
+    <w:p>
+      <w:pPr>
+        <w:pStyle w:val="ListBullet"/>
+      </w:pPr>
+      <w:r>
+        <w:rPr>
+          <w:rFonts w:ascii="Calibri" w:hAnsi="Calibri" w:eastAsia="Calibri" w:cs="Arial"/>
+          <w:lang w:val="de-DE"/>
+        </w:rPr>
         <w:t>Die App bildet den Mittelwert beider Augen. Unterschiede zwischen den Augen zeigt sie nicht.</w:t>
       </w:r>
     </w:p>
@@ -2667,7 +2977,7 @@
           <w:rFonts w:ascii="Calibri" w:hAnsi="Calibri" w:eastAsia="Calibri" w:cs="Arial"/>
           <w:lang w:val="de-DE"/>
         </w:rPr>
-        <w:t>.</w:t>
+        <w:t>. Zur Augenspur gehören je Bild 17 Gesichtspunkte pro Auge (Augenwinkel, Lidrand, Iris), etwa 1 MB pro Messung, aber keine Bilder.</w:t>
       </w:r>
     </w:p>
     <w:p>

</xml_diff>

<commit_message>
Augenspur: durchgehende Striche, Breite der Reflexbewegung in mm; Version 2.4.1
- Striche als zusammenhängende Linien (Lücken überbrückt), Mittel beider Augen, Mitgleiten leicht geglättet
- Breite jedes Rücksprungs in mm am Gegenstrich, Mittelwert mit Messschwankung unter dem Bild
- Vergrößerung nach der Breite der Rücksprünge (bis 25×); senkrecht Augen in der Bildmitte
- Hebräisch: Zeichen ° und ± stehen auf der richtigen Seite der Zahl
- Anleitung (de, en, he) ergänzt, docx neu erzeugt; Tests für Glätten und Rücksprünge

Co-Authored-By: Claude Opus 5.5 <noreply@anthropic.com>
</commit_message>
<xml_diff>
--- a/docs/guide_de.docx
+++ b/docs/guide_de.docx
@@ -2542,7 +2542,7 @@
           <w:rFonts w:ascii="Calibri" w:hAnsi="Calibri" w:eastAsia="Calibri" w:cs="Arial"/>
           <w:lang w:val="de-DE"/>
         </w:rPr>
-        <w:t xml:space="preserve"> Die Bewegung der Iris der letzten gut einer Sekunde läuft wie bei einem Schreiber als Spur nach unten weg. Das </w:t>
+        <w:t xml:space="preserve"> Die Bewegung der Iris der letzten gut einer Sekunde läuft wie bei einem Schreiber als Spur nach unten weg (bei senkrechter Messung zur Seite). Das </w:t>
       </w:r>
       <w:r>
         <w:rPr>
@@ -2574,7 +2574,28 @@
           <w:rFonts w:ascii="Calibri" w:hAnsi="Calibri" w:eastAsia="Calibri" w:cs="Arial"/>
           <w:lang w:val="de-DE"/>
         </w:rPr>
-        <w:t xml:space="preserve"> (schnelle Phase, orange) als kurzer Gegenstrich. Weil die Bewegung nur Bruchteile eines Millimeters beträgt, sind die Striche in Laufrichtung vergrößert; der Faktor steht im Bild.</w:t>
+        <w:t xml:space="preserve"> (schnelle Phase, orange) als Gegenstrich. Weil die Bewegung nur Bruchteile eines Millimeters beträgt, sind die Striche in Laufrichtung vergrößert; der Faktor steht im Bild. Die Striche zeigen das Mittel beider Augen; das Mitgleiten ist leicht geglättet.</w:t>
+      </w:r>
+    </w:p>
+    <w:p>
+      <w:pPr>
+        <w:pStyle w:val="ListBullet"/>
+      </w:pPr>
+      <w:r>
+        <w:rPr>
+          <w:rFonts w:ascii="Calibri" w:hAnsi="Calibri" w:eastAsia="Calibri" w:cs="Arial"/>
+          <w:b/>
+          <w:bCs/>
+          <w:lang w:val="de-DE"/>
+        </w:rPr>
+        <w:t>Breite der Reflexbewegung:</w:t>
+      </w:r>
+      <w:r>
+        <w:rPr>
+          <w:rFonts w:ascii="Calibri" w:hAnsi="Calibri" w:eastAsia="Calibri" w:cs="Arial"/>
+          <w:lang w:val="de-DE"/>
+        </w:rPr>
+        <w:t xml:space="preserve"> Die Länge eines Gegenstrichs zeigt, wie weit das Auge mitgeglitten ist, bevor es zurückspringt. Neben jedem Gegenstrich steht diese Breite in mm. Unter dem Bild steht die mittlere Breite aller Rücksprünge des Durchgangs in mm und Grad, mit der Messschwankung (±).</w:t>
       </w:r>
     </w:p>
     <w:p>
@@ -2616,7 +2637,7 @@
           <w:rFonts w:ascii="Calibri" w:hAnsi="Calibri" w:eastAsia="Calibri" w:cs="Arial"/>
           <w:lang w:val="de-DE"/>
         </w:rPr>
-        <w:t xml:space="preserve"> Mitgleiten in °/s und mm/s, mittlerer Rücksprung in Grad und mm, dazu die Messschwankung je Bild.</w:t>
+        <w:t xml:space="preserve"> mittlere Breite der Reflexbewegung (siehe oben), Mitgleiten in °/s und mm/s, dazu die Messschwankung je Bild.</w:t>
       </w:r>
     </w:p>
     <w:p>
@@ -2637,7 +2658,7 @@
           <w:rFonts w:ascii="Calibri" w:hAnsi="Calibri" w:eastAsia="Calibri" w:cs="Arial"/>
           <w:lang w:val="de-DE"/>
         </w:rPr>
-        <w:t xml:space="preserve"> Grad stammen aus der Kalibrierung. Millimeter schätzt die App über den Irisdurchmesser, der bei Erwachsenen bei etwa 11,7 mm liegt. Einzelne Bilder schwanken etwa um die angezeigte Messschwankung; Werte über viele Bilder sind genauer.</w:t>
+        <w:t xml:space="preserve"> Grad stammen aus der Kalibrierung. Millimeter schätzt die App über den Irisdurchmesser, der bei Erwachsenen bei etwa 11,7 mm liegt. Einzelne Bilder schwanken etwa um die angezeigte Messschwankung; Werte über viele Bilder sind genauer. Die zweite Nachkommastelle eines einzelnen Gegenstrichs ist daher nur ungefähr, die mittlere Breite über viele Rücksprünge ist genauer.</w:t>
       </w:r>
     </w:p>
     <w:p>

</xml_diff>